<commit_message>
Added a border to the document
</commit_message>
<xml_diff>
--- a/Bug Report/Bug_Report.docx
+++ b/Bug Report/Bug_Report.docx
@@ -9,6 +9,8 @@
           <w:bCs/>
         </w:rPr>
       </w:pPr>
+      <w:bookmarkStart w:id="0" w:name="_GoBack"/>
+      <w:bookmarkEnd w:id="0"/>
       <w:r>
         <w:rPr>
           <w:b/>
@@ -1665,8 +1667,6 @@
           <w:bCs/>
         </w:rPr>
       </w:pPr>
-      <w:bookmarkStart w:id="0" w:name="_GoBack"/>
-      <w:bookmarkEnd w:id="0"/>
       <w:r>
         <w:rPr>
           <w:b/>
@@ -1839,6 +1839,12 @@
     <w:sectPr>
       <w:pgSz w:w="12240" w:h="15840"/>
       <w:pgMar w:top="1440" w:right="1440" w:bottom="1440" w:left="1440" w:header="720" w:footer="720" w:gutter="0"/>
+      <w:pgBorders w:offsetFrom="page">
+        <w:top w:val="single" w:sz="4" w:space="24" w:color="auto"/>
+        <w:left w:val="single" w:sz="4" w:space="24" w:color="auto"/>
+        <w:bottom w:val="single" w:sz="4" w:space="24" w:color="auto"/>
+        <w:right w:val="single" w:sz="4" w:space="24" w:color="auto"/>
+      </w:pgBorders>
       <w:cols w:space="720"/>
       <w:docGrid w:linePitch="360"/>
     </w:sectPr>
@@ -3412,6 +3418,7 @@
   <w:style w:type="character" w:default="1" w:styleId="DefaultParagraphFont">
     <w:name w:val="Default Paragraph Font"/>
     <w:uiPriority w:val="1"/>
+    <w:semiHidden/>
     <w:unhideWhenUsed/>
   </w:style>
   <w:style w:type="table" w:default="1" w:styleId="TableNormal">

</xml_diff>